<commit_message>
Resume formatting: 2-page paper layout, no horizontal scroll on screens
Paper (DOCX/PDF via generator.py):
- 3 pages -> 2 pages: tighter bullet spacing (10pt -> 0 after),
  single line spacing, narrower bullet indent
- Name title 28pt -> 20pt, tightened rule and contact spacing
- Job entries no longer glued into unbreakable blocks (was
  stranding blank space at page bottoms); header stays with
  first bullet, lists flow across pages
- Skills section allowed to break across pages
- Margins: top 0.15->0.10in, bottom 0.25->0.20in; footer 8pt

Screen (HTML):
- Zero horizontal scrolling at 390/768/1280px (verified):
  border-box everywhere, overflow-x hidden backstop
- Skill/interest headings wrap instead of ellipsis truncation
- Skill-level badges flow inline on phones; corner ribbons
  hidden below 768px; long links/words wrap

No content or wording changed; YAML remains source of truth.
</commit_message>
<xml_diff>
--- a/build/bruno.bronosky.resume.docx
+++ b/build/bruno.bronosky.resume.docx
@@ -13,6 +13,7 @@
     </w:p>
     <w:p>
       <w:pPr>
+        <w:spacing w:after="0"/>
         <w:jc w:val="center"/>
       </w:pPr>
       <w:hyperlink r:id="rId10">
@@ -94,7 +95,6 @@
     <w:p>
       <w:pPr>
         <w:pStyle w:val="MyBulletStyle"/>
-        <w:keepNext/>
       </w:pPr>
       <w:r>
         <w:t>Develop AI tools to shorten ticket completion times</w:t>
@@ -103,7 +103,6 @@
     <w:p>
       <w:pPr>
         <w:pStyle w:val="MyBulletStyle"/>
-        <w:keepNext/>
       </w:pPr>
       <w:r>
         <w:t>Develop AI tools to on-board new team members</w:t>
@@ -112,7 +111,6 @@
     <w:p>
       <w:pPr>
         <w:pStyle w:val="MyBulletStyle"/>
-        <w:keepNext/>
       </w:pPr>
       <w:r>
         <w:t>Document Dev-Ops processes and Infrastructure to improve AI tool efficiency.</w:t>
@@ -156,7 +154,6 @@
     <w:p>
       <w:pPr>
         <w:pStyle w:val="MyBulletStyle"/>
-        <w:keepNext/>
       </w:pPr>
       <w:r>
         <w:t>Manage engineers and projects</w:t>
@@ -165,7 +162,6 @@
     <w:p>
       <w:pPr>
         <w:pStyle w:val="MyBulletStyle"/>
-        <w:keepNext/>
       </w:pPr>
       <w:r>
         <w:t>Developed secure API endpoints and OpenClaw agent skills to automate infrastructure interaction and monitoring</w:t>
@@ -174,7 +170,6 @@
     <w:p>
       <w:pPr>
         <w:pStyle w:val="MyBulletStyle"/>
-        <w:keepNext/>
       </w:pPr>
       <w:r>
         <w:t>Deployed local, privacy-compliant LLMs to accelerate engineering velocity while protecting proprietary data</w:t>
@@ -183,7 +178,6 @@
     <w:p>
       <w:pPr>
         <w:pStyle w:val="MyBulletStyle"/>
-        <w:keepNext/>
       </w:pPr>
       <w:r>
         <w:t>Leveraged AI coding agents to rapidly refactor complex systems and automate infrastructure-as-code</w:t>
@@ -192,7 +186,6 @@
     <w:p>
       <w:pPr>
         <w:pStyle w:val="MyBulletStyle"/>
-        <w:keepNext/>
       </w:pPr>
       <w:r>
         <w:t>Mentored engineering teams on adopting AI-augmented workflows and integrating LLMs into CI/CD pipelines</w:t>
@@ -201,7 +194,6 @@
     <w:p>
       <w:pPr>
         <w:pStyle w:val="MyBulletStyle"/>
-        <w:keepNext/>
       </w:pPr>
       <w:r>
         <w:t>Validate R &amp; D plans and results</w:t>
@@ -210,7 +202,6 @@
     <w:p>
       <w:pPr>
         <w:pStyle w:val="MyBulletStyle"/>
-        <w:keepNext/>
       </w:pPr>
       <w:r>
         <w:t>3D modeling and CNC manufacturing</w:t>
@@ -219,7 +210,6 @@
     <w:p>
       <w:pPr>
         <w:pStyle w:val="MyBulletStyle"/>
-        <w:keepNext/>
       </w:pPr>
       <w:r>
         <w:t>Safety and fire suppression</w:t>
@@ -228,7 +218,6 @@
     <w:p>
       <w:pPr>
         <w:pStyle w:val="MyBulletStyle"/>
-        <w:keepNext/>
       </w:pPr>
       <w:r>
         <w:t>Design and implement sensor arrays for data gathering</w:t>
@@ -237,7 +226,6 @@
     <w:p>
       <w:pPr>
         <w:pStyle w:val="MyBulletStyle"/>
-        <w:keepNext/>
       </w:pPr>
       <w:r>
         <w:t>Develop real-time monitoring systems in Python</w:t>
@@ -246,7 +234,6 @@
     <w:p>
       <w:pPr>
         <w:pStyle w:val="MyBulletStyle"/>
-        <w:keepNext/>
       </w:pPr>
       <w:r>
         <w:t>AI data analysis and fault prediction</w:t>
@@ -299,7 +286,6 @@
     <w:p>
       <w:pPr>
         <w:pStyle w:val="MyBulletStyle"/>
-        <w:keepNext/>
       </w:pPr>
       <w:r>
         <w:t>CI/CD with Harness.io, AWS infrastructure with CDK+CFN, Migration to Github Enterprise from 5 other VCS</w:t>
@@ -352,7 +338,6 @@
     <w:p>
       <w:pPr>
         <w:pStyle w:val="MyBulletStyle"/>
-        <w:keepNext/>
       </w:pPr>
       <w:r>
         <w:t>CI/CD with CloudBees/Jenkins and Argo-CD</w:t>
@@ -405,7 +390,6 @@
     <w:p>
       <w:pPr>
         <w:pStyle w:val="MyBulletStyle"/>
-        <w:keepNext/>
       </w:pPr>
       <w:r>
         <w:t>Robotics R&amp;D, GCP, Machine Learning, Computer Vision, Software Development, Network &amp; Physical Architecture, DevSecOps, Linux System Administration</w:t>
@@ -458,7 +442,6 @@
     <w:p>
       <w:pPr>
         <w:pStyle w:val="MyBulletStyle"/>
-        <w:keepNext/>
       </w:pPr>
       <w:r>
         <w:t>CI/CD with Jenkins, SonarQube, JMeter, various software testing tools</w:t>
@@ -467,7 +450,6 @@
     <w:p>
       <w:pPr>
         <w:pStyle w:val="MyBulletStyle"/>
-        <w:keepNext/>
       </w:pPr>
       <w:r>
         <w:t>Azure &amp; AWS infrastructure and network security architecture</w:t>
@@ -511,7 +493,6 @@
     <w:p>
       <w:pPr>
         <w:pStyle w:val="MyBulletStyle"/>
-        <w:keepNext/>
       </w:pPr>
       <w:r>
         <w:t>Direct and train a department of DevOps Engineers and SREs.</w:t>
@@ -520,7 +501,6 @@
     <w:p>
       <w:pPr>
         <w:pStyle w:val="MyBulletStyle"/>
-        <w:keepNext/>
       </w:pPr>
       <w:r>
         <w:t>Train developers to follow DevOps &amp; CI/CD processes.</w:t>
@@ -529,7 +509,6 @@
     <w:p>
       <w:pPr>
         <w:pStyle w:val="MyBulletStyle"/>
-        <w:keepNext/>
       </w:pPr>
       <w:r>
         <w:t>Architect Hybrid-Cloud and Multi-Cloud infrastructure.</w:t>
@@ -538,7 +517,6 @@
     <w:p>
       <w:pPr>
         <w:pStyle w:val="MyBulletStyle"/>
-        <w:keepNext/>
       </w:pPr>
       <w:r>
         <w:t>Set and enforce security practices.</w:t>
@@ -547,7 +525,6 @@
     <w:p>
       <w:pPr>
         <w:pStyle w:val="MyBulletStyle"/>
-        <w:keepNext/>
       </w:pPr>
       <w:r>
         <w:t>Develop tools and services in bash, Node.js, Python, and Go.</w:t>
@@ -556,7 +533,6 @@
     <w:p>
       <w:pPr>
         <w:pStyle w:val="MyBulletStyle"/>
-        <w:keepNext/>
       </w:pPr>
       <w:r>
         <w:t>Design, build, and deploy Docker containers, API Gateways.</w:t>
@@ -565,7 +541,6 @@
     <w:p>
       <w:pPr>
         <w:pStyle w:val="MyBulletStyle"/>
-        <w:keepNext/>
       </w:pPr>
       <w:r>
         <w:t>Automate and orchestrate infrastructure with Packer and Terraform.</w:t>
@@ -574,7 +549,6 @@
     <w:p>
       <w:pPr>
         <w:pStyle w:val="MyBulletStyle"/>
-        <w:keepNext/>
       </w:pPr>
       <w:r>
         <w:t>Build and maintain [Fargate] ECS, EKS, and Kubernetes clusters serving microservices.</w:t>
@@ -583,7 +557,6 @@
     <w:p>
       <w:pPr>
         <w:pStyle w:val="MyBulletStyle"/>
-        <w:keepNext/>
       </w:pPr>
       <w:r>
         <w:t>Manage AWS costs.</w:t>
@@ -592,7 +565,6 @@
     <w:p>
       <w:pPr>
         <w:pStyle w:val="MyBulletStyle"/>
-        <w:keepNext/>
       </w:pPr>
       <w:r>
         <w:t>Make and document changes to AWS infrastructure via aws-cli.</w:t>
@@ -601,7 +573,6 @@
     <w:p>
       <w:pPr>
         <w:pStyle w:val="MyBulletStyle"/>
-        <w:keepNext/>
       </w:pPr>
       <w:r>
         <w:t>Manage network security with AWS Security Groups, iptables, and OpenVPN.</w:t>
@@ -645,7 +616,6 @@
     <w:p>
       <w:pPr>
         <w:pStyle w:val="MyBulletStyle"/>
-        <w:keepNext/>
       </w:pPr>
       <w:r>
         <w:t>Orchestrate infrastructure with Packer, Terraform, Chef, and Ansible.</w:t>
@@ -654,7 +624,6 @@
     <w:p>
       <w:pPr>
         <w:pStyle w:val="MyBulletStyle"/>
-        <w:keepNext/>
       </w:pPr>
       <w:r>
         <w:t>Build and maintain Kubernetes clusters serving microservices.</w:t>
@@ -663,7 +632,6 @@
     <w:p>
       <w:pPr>
         <w:pStyle w:val="MyBulletStyle"/>
-        <w:keepNext/>
       </w:pPr>
       <w:r>
         <w:t>Develop tools in Python, Go, bash, awk, sed, CircuitPython, and Arduino.</w:t>
@@ -672,7 +640,6 @@
     <w:p>
       <w:pPr>
         <w:pStyle w:val="MyBulletStyle"/>
-        <w:keepNext/>
       </w:pPr>
       <w:r>
         <w:t>Build and maintain Cassandra, MongoDB, and MySQL databases.</w:t>
@@ -681,7 +648,6 @@
     <w:p>
       <w:pPr>
         <w:pStyle w:val="MyBulletStyle"/>
-        <w:keepNext/>
       </w:pPr>
       <w:r>
         <w:t>Build custom Raspberry Pi images for IoT devices sent to client locations.</w:t>
@@ -725,7 +691,6 @@
     <w:p>
       <w:pPr>
         <w:pStyle w:val="MyBulletStyle"/>
-        <w:keepNext/>
       </w:pPr>
       <w:r>
         <w:t>Develop mobile client and backend POCs.</w:t>
@@ -734,7 +699,6 @@
     <w:p>
       <w:pPr>
         <w:pStyle w:val="MyBulletStyle"/>
-        <w:keepNext/>
       </w:pPr>
       <w:r>
         <w:t>Architect and deploy cloud infrastructure.</w:t>
@@ -743,7 +707,6 @@
     <w:p>
       <w:pPr>
         <w:pStyle w:val="MyBulletStyle"/>
-        <w:keepNext/>
       </w:pPr>
       <w:r>
         <w:t>Develop and maintain original Open Source software projects.</w:t>
@@ -752,7 +715,6 @@
     <w:p>
       <w:pPr>
         <w:pStyle w:val="MyBulletStyle"/>
-        <w:keepNext/>
       </w:pPr>
       <w:r>
         <w:t>Workflow and process automation.</w:t>
@@ -761,7 +723,6 @@
     <w:p>
       <w:pPr>
         <w:pStyle w:val="MyBulletStyle"/>
-        <w:keepNext/>
       </w:pPr>
       <w:r>
         <w:t>Lead mobile architecture and technical strategy.</w:t>
@@ -805,7 +766,6 @@
     <w:p>
       <w:pPr>
         <w:pStyle w:val="MyBulletStyle"/>
-        <w:keepNext/>
       </w:pPr>
       <w:r>
         <w:t>Co-Manage a ~30 developer team.</w:t>
@@ -814,7 +774,6 @@
     <w:p>
       <w:pPr>
         <w:pStyle w:val="MyBulletStyle"/>
-        <w:keepNext/>
       </w:pPr>
       <w:r>
         <w:t>Improve performance through coaching.</w:t>
@@ -823,7 +782,6 @@
     <w:p>
       <w:pPr>
         <w:pStyle w:val="MyBulletStyle"/>
-        <w:keepNext/>
       </w:pPr>
       <w:r>
         <w:t>Encourage and inspire developers and vendors to give great service.</w:t>
@@ -832,7 +790,6 @@
     <w:p>
       <w:pPr>
         <w:pStyle w:val="MyBulletStyle"/>
-        <w:keepNext/>
       </w:pPr>
       <w:r>
         <w:t>Workflow automation scripting.</w:t>
@@ -876,7 +833,6 @@
     <w:p>
       <w:pPr>
         <w:pStyle w:val="MyBulletStyle"/>
-        <w:keepNext/>
       </w:pPr>
       <w:r>
         <w:t>Administer GNU/Linux servers.</w:t>
@@ -885,7 +841,6 @@
     <w:p>
       <w:pPr>
         <w:pStyle w:val="MyBulletStyle"/>
-        <w:keepNext/>
       </w:pPr>
       <w:r>
         <w:t>Manage a department of sysadmins.</w:t>
@@ -929,7 +884,6 @@
     <w:p>
       <w:pPr>
         <w:pStyle w:val="MyBulletStyle"/>
-        <w:keepNext/>
       </w:pPr>
       <w:r>
         <w:t>Administer MySQL.</w:t>
@@ -938,7 +892,6 @@
     <w:p>
       <w:pPr>
         <w:pStyle w:val="MyBulletStyle"/>
-        <w:keepNext/>
       </w:pPr>
       <w:r>
         <w:t>Optimize developer code.</w:t>
@@ -947,7 +900,6 @@
     <w:p>
       <w:pPr>
         <w:pStyle w:val="MyBulletStyle"/>
-        <w:keepNext/>
       </w:pPr>
       <w:r>
         <w:t>Maintain high availability and performance.</w:t>
@@ -991,7 +943,6 @@
     <w:p>
       <w:pPr>
         <w:pStyle w:val="MyBulletStyle"/>
-        <w:keepNext/>
       </w:pPr>
       <w:r>
         <w:t>Manage teams, projects, SLAs.</w:t>
@@ -1000,7 +951,6 @@
     <w:p>
       <w:pPr>
         <w:pStyle w:val="MyBulletStyle"/>
-        <w:keepNext/>
       </w:pPr>
       <w:r>
         <w:t>Automate workflows.</w:t>
@@ -1009,7 +959,6 @@
     <w:p>
       <w:pPr>
         <w:pStyle w:val="MyBulletStyle"/>
-        <w:keepNext/>
       </w:pPr>
       <w:r>
         <w:t>Develop PHP web applications.</w:t>
@@ -1053,7 +1002,6 @@
     <w:p>
       <w:pPr>
         <w:pStyle w:val="MyBulletStyle"/>
-        <w:keepNext/>
       </w:pPr>
       <w:r>
         <w:t>Companies include: Apple Computer, Lanier Worldwide, MedCenterDirect, Amazing Graphics, World Wide Development, and freelance work</w:t>
@@ -1079,7 +1027,6 @@
     <w:p>
       <w:pPr>
         <w:pStyle w:val="MySectionStyle"/>
-        <w:keepNext/>
       </w:pPr>
       <w:r>
         <w:rPr>
@@ -1094,7 +1041,6 @@
     <w:p>
       <w:pPr>
         <w:pStyle w:val="MySectionStyle"/>
-        <w:keepNext/>
       </w:pPr>
       <w:r>
         <w:rPr>
@@ -1109,7 +1055,6 @@
     <w:p>
       <w:pPr>
         <w:pStyle w:val="MySectionStyle"/>
-        <w:keepNext/>
       </w:pPr>
       <w:r>
         <w:rPr>
@@ -1124,7 +1069,6 @@
     <w:p>
       <w:pPr>
         <w:pStyle w:val="MySectionStyle"/>
-        <w:keepNext/>
       </w:pPr>
       <w:r>
         <w:rPr>
@@ -1139,7 +1083,6 @@
     <w:p>
       <w:pPr>
         <w:pStyle w:val="MySectionStyle"/>
-        <w:keepNext/>
       </w:pPr>
       <w:r>
         <w:rPr>
@@ -1154,7 +1097,6 @@
     <w:p>
       <w:pPr>
         <w:pStyle w:val="MySectionStyle"/>
-        <w:keepNext/>
       </w:pPr>
       <w:r>
         <w:rPr>
@@ -1169,7 +1111,6 @@
     <w:p>
       <w:pPr>
         <w:pStyle w:val="MySectionStyle"/>
-        <w:keepNext/>
       </w:pPr>
       <w:r>
         <w:rPr>
@@ -1184,7 +1125,6 @@
     <w:p>
       <w:pPr>
         <w:pStyle w:val="MySectionStyle"/>
-        <w:keepNext/>
       </w:pPr>
       <w:r>
         <w:rPr>
@@ -1199,7 +1139,6 @@
     <w:p>
       <w:pPr>
         <w:pStyle w:val="MySectionStyle"/>
-        <w:keepNext/>
       </w:pPr>
       <w:r>
         <w:rPr>
@@ -1214,7 +1153,6 @@
     <w:p>
       <w:pPr>
         <w:pStyle w:val="MySectionStyle"/>
-        <w:keepNext/>
       </w:pPr>
       <w:r>
         <w:rPr>
@@ -1229,7 +1167,6 @@
     <w:p>
       <w:pPr>
         <w:pStyle w:val="MySectionStyle"/>
-        <w:keepNext/>
       </w:pPr>
       <w:r>
         <w:rPr>
@@ -1258,7 +1195,7 @@
     <w:sectPr>
       <w:footerReference w:type="default" r:id="rId9"/>
       <w:pgSz w:w="12240" w:h="15840"/>
-      <w:pgMar w:top="216" w:right="432" w:bottom="360" w:left="432" w:header="720" w:footer="720" w:gutter="0"/>
+      <w:pgMar w:top="144" w:right="432" w:bottom="288" w:left="432" w:header="720" w:footer="720" w:gutter="0"/>
       <w:cols w:space="720"/>
       <w:docGrid w:linePitch="360"/>
     </w:sectPr>
@@ -1274,17 +1211,29 @@
       <w:jc w:val="center"/>
     </w:pPr>
     <w:r>
+      <w:rPr>
+        <w:sz w:val="16"/>
+      </w:rPr>
       <w:t xml:space="preserve">Page </w:t>
     </w:r>
     <w:r>
+      <w:rPr>
+        <w:sz w:val="16"/>
+      </w:rPr>
       <w:fldChar w:fldCharType="begin"/>
       <w:instrText xml:space="preserve">PAGE</w:instrText>
       <w:fldChar w:fldCharType="end"/>
     </w:r>
     <w:r>
+      <w:rPr>
+        <w:sz w:val="16"/>
+      </w:rPr>
       <w:t xml:space="preserve"> of </w:t>
     </w:r>
     <w:r>
+      <w:rPr>
+        <w:sz w:val="16"/>
+      </w:rPr>
       <w:fldChar w:fldCharType="begin"/>
       <w:instrText xml:space="preserve">NUMPAGES</w:instrText>
       <w:fldChar w:fldCharType="end"/>
@@ -1656,6 +1605,9 @@
     <w:name w:val="Normal"/>
     <w:qFormat/>
     <w:rsid w:val="00FC693F"/>
+    <w:pPr>
+      <w:spacing w:line="240" w:lineRule="auto" w:after="20"/>
+    </w:pPr>
     <w:rPr>
       <w:rFonts w:ascii="Calibri" w:hAnsi="Calibri"/>
       <w:sz w:val="18"/>
@@ -1716,7 +1668,7 @@
     <w:pPr>
       <w:keepNext/>
       <w:keepLines/>
-      <w:spacing w:before="80" w:after="0"/>
+      <w:spacing w:before="40" w:after="40"/>
       <w:outlineLvl w:val="0"/>
     </w:pPr>
     <w:rPr>
@@ -2003,7 +1955,7 @@
     <w:rsid w:val="00FC693F"/>
     <w:pPr>
       <w:pBdr>
-        <w:bottom w:val="single" w:sz="8" w:space="4" w:color="4F81BD" w:themeColor="accent1"/>
+        <w:bottom w:val="single" w:sz="8" w:space="1" w:color="4F81BD" w:themeColor="accent1"/>
       </w:pBdr>
       <w:spacing w:after="40" w:line="240" w:lineRule="auto"/>
       <w:contextualSpacing/>
@@ -2013,7 +1965,7 @@
       <w:color w:val="17365D" w:themeColor="text2" w:themeShade="BF"/>
       <w:spacing w:val="5"/>
       <w:kern w:val="28"/>
-      <w:sz w:val="52"/>
+      <w:sz w:val="40"/>
       <w:szCs w:val="52"/>
     </w:rPr>
   </w:style>
@@ -13354,7 +13306,8 @@
     <w:name w:val="MyBulletStyle"/>
     <w:basedOn w:val="ListBullet"/>
     <w:pPr>
-      <w:spacing w:after="200"/>
+      <w:spacing w:after="0"/>
+      <w:ind w:left="432" w:hanging="259"/>
     </w:pPr>
   </w:style>
   <w:style w:type="character" w:customStyle="1" w:styleId="CustomLabel">

</xml_diff>

<commit_message>
Summary: add vendor-neutral automation sentence
Co-Authored-By: Claude Sonnet 5.5 <noreply@anthropic.com>
</commit_message>
<xml_diff>
--- a/build/bruno.bronosky.resume.docx
+++ b/build/bruno.bronosky.resume.docx
@@ -47,13 +47,15 @@
       <w:r>
         <w:t>Engineer, architect, and mentor with 28+ years in DevOps, cloud platforms, infrastructure automation, and software</w:t>
         <w:br/>
-        <w:t>engineering. I power these disciplines with an AI-augmented workflow, leveraging autonomous agents (OpenClaw, OpenCode)</w:t>
+        <w:t>engineering. I turn operational work into durable scripts, API integrations, and CI/CD workflows across Python,</w:t>
         <w:br/>
-        <w:t>and self-hosted LLMs to massively accelerate infrastructure delivery, pipeline analysis, and code refactoring.</w:t>
+        <w:t>Bash, GitHub Actions, and AWS, Azure, and GCP. I power these disciplines with an AI-augmented workflow, leveraging</w:t>
         <w:br/>
-        <w:t>Adept at building secure API tools for AI integration, teaching best practices, and driving business-critical</w:t>
+        <w:t>autonomous agents (OpenClaw, OpenCode) and self-hosted LLMs to massively accelerate infrastructure delivery,</w:t>
         <w:br/>
-        <w:t>transformations across cloud, mobile, and embedded systems.</w:t>
+        <w:t>pipeline analysis, and code refactoring. Adept at building secure API tools for AI integration, teaching best</w:t>
+        <w:br/>
+        <w:t>practices, and driving business-critical transformations across cloud, mobile, and embedded systems.</w:t>
       </w:r>
     </w:p>
     <w:p>

</xml_diff>

<commit_message>
Variants: one filter for every output; retire display flags and DBA fork
The web page ignored `display`, so it showed "Various" and then the same
early jobs again, and the 2021-23 contract work twice. Now
tools/resume-variant.py builds plain JSON Resume per variant
(src/variants/{web,paper,ats,mysql-dba}.yaml) and the HTML theme and DOCX
generator only render that JSON.

- Every work entry has an id. `display` is replaced by `variants:`
  (omitted = all, `[None]` = source only, `!name` = all but) and
  aggregates declare `replaces:` ("Various", NDA clients x4).
- web is exhaustive with no aggregates; paper/ats cap bullets by job age
  (source order = priority).
- The untracked mysql-dba-contractor fork becomes a one-off overlay; its
  unique bullets live in the main YAML tagged for it.
- Includes pending fixes: 30+ years, NDA aggregate dates, Lambda typo,
  DevOps spelling, era-appropriate skill tags on 1995-2004 jobs.

Co-Authored-By: Claude Opus 5.5 <noreply@anthropic.com>
</commit_message>
<xml_diff>
--- a/build/bruno.bronosky.resume.docx
+++ b/build/bruno.bronosky.resume.docx
@@ -117,7 +117,7 @@
         <w:keepNext/>
       </w:pPr>
       <w:r>
-        <w:t>Document Dev-Ops processes and Infrastructure to improve AI tool efficiency.</w:t>
+        <w:t>Document DevOps processes and Infrastructure to improve AI tool efficiency.</w:t>
       </w:r>
     </w:p>
     <w:p>
@@ -134,7 +134,7 @@
         <w:pStyle w:val="MyBulletStyle"/>
       </w:pPr>
       <w:r>
-        <w:t>Dev-Ops</w:t>
+        <w:t>DevOps</w:t>
       </w:r>
     </w:p>
     <w:p>
@@ -230,54 +230,9 @@
     <w:p>
       <w:pPr>
         <w:pStyle w:val="MyBulletStyle"/>
-        <w:keepNext/>
       </w:pPr>
       <w:r>
         <w:t>3D modeling and CNC manufacturing</w:t>
-      </w:r>
-    </w:p>
-    <w:p>
-      <w:pPr>
-        <w:pStyle w:val="MyBulletStyle"/>
-        <w:keepNext/>
-      </w:pPr>
-      <w:r>
-        <w:t>Safety and fire suppression</w:t>
-      </w:r>
-    </w:p>
-    <w:p>
-      <w:pPr>
-        <w:pStyle w:val="MyBulletStyle"/>
-        <w:keepNext/>
-      </w:pPr>
-      <w:r>
-        <w:t>Design and implement sensor arrays for data gathering</w:t>
-      </w:r>
-    </w:p>
-    <w:p>
-      <w:pPr>
-        <w:pStyle w:val="MyBulletStyle"/>
-        <w:keepNext/>
-      </w:pPr>
-      <w:r>
-        <w:t>Develop real-time monitoring systems in Python</w:t>
-      </w:r>
-    </w:p>
-    <w:p>
-      <w:pPr>
-        <w:pStyle w:val="MyBulletStyle"/>
-        <w:keepNext/>
-      </w:pPr>
-      <w:r>
-        <w:t>AI data analysis and fault prediction</w:t>
-      </w:r>
-    </w:p>
-    <w:p>
-      <w:pPr>
-        <w:pStyle w:val="MyBulletStyle"/>
-      </w:pPr>
-      <w:r>
-        <w:t>Plan and administer a Digital Arts division</w:t>
       </w:r>
     </w:p>
     <w:p>
@@ -594,63 +549,9 @@
     <w:p>
       <w:pPr>
         <w:pStyle w:val="MyBulletStyle"/>
-        <w:keepNext/>
       </w:pPr>
       <w:r>
         <w:t>Built Python automation against cloud and service APIs for infrastructure operations.</w:t>
-      </w:r>
-    </w:p>
-    <w:p>
-      <w:pPr>
-        <w:pStyle w:val="MyBulletStyle"/>
-        <w:keepNext/>
-      </w:pPr>
-      <w:r>
-        <w:t>Built GitHub Actions workflows professionally from 2020, using Actions pragmatically and offloading larger execution to cloud-native services when appropriate.</w:t>
-      </w:r>
-    </w:p>
-    <w:p>
-      <w:pPr>
-        <w:pStyle w:val="MyBulletStyle"/>
-        <w:keepNext/>
-      </w:pPr>
-      <w:r>
-        <w:t>Build and maintain [Fargate] ECS, EKS, and Kubernetes clusters serving microservices.</w:t>
-      </w:r>
-    </w:p>
-    <w:p>
-      <w:pPr>
-        <w:pStyle w:val="MyBulletStyle"/>
-        <w:keepNext/>
-      </w:pPr>
-      <w:r>
-        <w:t>Manage AWS costs.</w:t>
-      </w:r>
-    </w:p>
-    <w:p>
-      <w:pPr>
-        <w:pStyle w:val="MyBulletStyle"/>
-        <w:keepNext/>
-      </w:pPr>
-      <w:r>
-        <w:t>Make and document changes to AWS infrastructure via aws-cli.</w:t>
-      </w:r>
-    </w:p>
-    <w:p>
-      <w:pPr>
-        <w:pStyle w:val="MyBulletStyle"/>
-        <w:keepNext/>
-      </w:pPr>
-      <w:r>
-        <w:t>Manage network security with AWS Security Groups, iptables, and OpenVPN.</w:t>
-      </w:r>
-    </w:p>
-    <w:p>
-      <w:pPr>
-        <w:pStyle w:val="MyBulletStyle"/>
-      </w:pPr>
-      <w:r>
-        <w:t>Maintain MongoDB and DynamoDB databases.</w:t>
       </w:r>
     </w:p>
     <w:p>
@@ -719,36 +620,9 @@
     <w:p>
       <w:pPr>
         <w:pStyle w:val="MyBulletStyle"/>
-        <w:keepNext/>
       </w:pPr>
       <w:r>
         <w:t>Automated infrastructure and operational workflows with Python and PowerShell where Windows administration or executable documentation was required.</w:t>
-      </w:r>
-    </w:p>
-    <w:p>
-      <w:pPr>
-        <w:pStyle w:val="MyBulletStyle"/>
-        <w:keepNext/>
-      </w:pPr>
-      <w:r>
-        <w:t>Maintained database-backed production systems with emphasis on operational health, performance, and reliability.</w:t>
-      </w:r>
-    </w:p>
-    <w:p>
-      <w:pPr>
-        <w:pStyle w:val="MyBulletStyle"/>
-        <w:keepNext/>
-      </w:pPr>
-      <w:r>
-        <w:t>Build custom Raspberry Pi images for IoT devices sent to client locations.</w:t>
-      </w:r>
-    </w:p>
-    <w:p>
-      <w:pPr>
-        <w:pStyle w:val="MyBulletStyle"/>
-      </w:pPr>
-      <w:r>
-        <w:t>Design, 3D Model, and CNC mill custom IoT hardware cases.</w:t>
       </w:r>
     </w:p>
     <w:p>
@@ -817,36 +691,9 @@
     <w:p>
       <w:pPr>
         <w:pStyle w:val="MyBulletStyle"/>
-        <w:keepNext/>
       </w:pPr>
       <w:r>
         <w:t>Integrated ServiceNow ticket/workflow data into CI/CD and operational analysis workflows.</w:t>
-      </w:r>
-    </w:p>
-    <w:p>
-      <w:pPr>
-        <w:pStyle w:val="MyBulletStyle"/>
-        <w:keepNext/>
-      </w:pPr>
-      <w:r>
-        <w:t>Workflow and process automation.</w:t>
-      </w:r>
-    </w:p>
-    <w:p>
-      <w:pPr>
-        <w:pStyle w:val="MyBulletStyle"/>
-        <w:keepNext/>
-      </w:pPr>
-      <w:r>
-        <w:t>Lead mobile architecture and technical strategy.</w:t>
-      </w:r>
-    </w:p>
-    <w:p>
-      <w:pPr>
-        <w:pStyle w:val="MyBulletStyle"/>
-      </w:pPr>
-      <w:r>
-        <w:t>Present and teach.</w:t>
       </w:r>
     </w:p>
     <w:p>
@@ -915,18 +762,9 @@
     <w:p>
       <w:pPr>
         <w:pStyle w:val="MyBulletStyle"/>
-        <w:keepNext/>
       </w:pPr>
       <w:r>
         <w:t>Partnered with ServiceNow administrators to extract ticket/request data for analysis and process automation.</w:t>
-      </w:r>
-    </w:p>
-    <w:p>
-      <w:pPr>
-        <w:pStyle w:val="MyBulletStyle"/>
-      </w:pPr>
-      <w:r>
-        <w:t>Architect and develop software.</w:t>
       </w:r>
     </w:p>
     <w:p>
@@ -977,18 +815,9 @@
     <w:p>
       <w:pPr>
         <w:pStyle w:val="MyBulletStyle"/>
-        <w:keepNext/>
       </w:pPr>
       <w:r>
         <w:t>Workflow automation and config management.</w:t>
-      </w:r>
-    </w:p>
-    <w:p>
-      <w:pPr>
-        <w:pStyle w:val="MyBulletStyle"/>
-      </w:pPr>
-      <w:r>
-        <w:t>Used ServiceNow as a ticket assignee/request creator and later as a workflow data source for operational analysis.</w:t>
       </w:r>
     </w:p>
     <w:p>
@@ -1039,27 +868,9 @@
     <w:p>
       <w:pPr>
         <w:pStyle w:val="MyBulletStyle"/>
-        <w:keepNext/>
       </w:pPr>
       <w:r>
         <w:t>Maintain high availability and performance.</w:t>
-      </w:r>
-    </w:p>
-    <w:p>
-      <w:pPr>
-        <w:pStyle w:val="MyBulletStyle"/>
-        <w:keepNext/>
-      </w:pPr>
-      <w:r>
-        <w:t>Develop extra Django and Rails projects.</w:t>
-      </w:r>
-    </w:p>
-    <w:p>
-      <w:pPr>
-        <w:pStyle w:val="MyBulletStyle"/>
-      </w:pPr>
-      <w:r>
-        <w:t>Used Python/Django for internal tooling before later expanding into cloud and REST/API automation.</w:t>
       </w:r>
     </w:p>
     <w:p>
@@ -1110,18 +921,9 @@
     <w:p>
       <w:pPr>
         <w:pStyle w:val="MyBulletStyle"/>
-        <w:keepNext/>
       </w:pPr>
       <w:r>
         <w:t>Develop PHP web applications.</w:t>
-      </w:r>
-    </w:p>
-    <w:p>
-      <w:pPr>
-        <w:pStyle w:val="MyBulletStyle"/>
-      </w:pPr>
-      <w:r>
-        <w:t>Administer FreeBSD, Apache, MySQL.</w:t>
       </w:r>
     </w:p>
     <w:p>
@@ -1204,7 +1006,7 @@
         <w:t>Amazon Web Services</w:t>
       </w:r>
       <w:r>
-        <w:t>: CDK · CFN · EC2 · ECS · EKS · Fargate · EBS · ELB · RDS · S3 · SNS · SQS · IAM · VPC · SSM · Lamda · Route53 · CloudFront · CloudWatch · GuardDuty · DynamoDB · Auto Scaling</w:t>
+        <w:t>: CDK · CFN · EC2 · ECS · EKS · Fargate · EBS · ELB · RDS · S3 · SNS · SQS · IAM · VPC · SSM · Lambda · Route53 · CloudFront · CloudWatch · GuardDuty · DynamoDB · Auto Scaling</w:t>
       </w:r>
     </w:p>
     <w:p>

</xml_diff>

<commit_message>
Paper resume back to 2 pages: build with this checkout's generator
.venv's resume-docx is an editable install of another clone
(~/src/resume on the Nix volume) with April's generator, which binds the
whole Skills section together and uses the older, looser spacing. That
pushed Skills to a 3rd page. The Makefile now runs
src/docx-generator from this checkout via PYTHONPATH, never a
resume-docx found on PATH.

Co-Authored-By: Claude Opus 5.5 <noreply@anthropic.com>
</commit_message>
<xml_diff>
--- a/build/bruno.bronosky.resume.docx
+++ b/build/bruno.bronosky.resume.docx
@@ -13,6 +13,7 @@
     </w:p>
     <w:p>
       <w:pPr>
+        <w:spacing w:after="0"/>
         <w:jc w:val="center"/>
       </w:pPr>
       <w:hyperlink r:id="rId10">
@@ -96,7 +97,6 @@
     <w:p>
       <w:pPr>
         <w:pStyle w:val="MyBulletStyle"/>
-        <w:keepNext/>
       </w:pPr>
       <w:r>
         <w:t>Develop AI tools to shorten ticket completion times</w:t>
@@ -105,7 +105,6 @@
     <w:p>
       <w:pPr>
         <w:pStyle w:val="MyBulletStyle"/>
-        <w:keepNext/>
       </w:pPr>
       <w:r>
         <w:t>Develop AI tools to on-board new team members</w:t>
@@ -114,7 +113,6 @@
     <w:p>
       <w:pPr>
         <w:pStyle w:val="MyBulletStyle"/>
-        <w:keepNext/>
       </w:pPr>
       <w:r>
         <w:t>Document DevOps processes and Infrastructure to improve AI tool efficiency.</w:t>
@@ -123,7 +121,6 @@
     <w:p>
       <w:pPr>
         <w:pStyle w:val="MyBulletStyle"/>
-        <w:keepNext/>
       </w:pPr>
       <w:r>
         <w:t>Automate and document repeatable infrastructure operations rather than relying on manual procedures.</w:t>
@@ -167,7 +164,6 @@
     <w:p>
       <w:pPr>
         <w:pStyle w:val="MyBulletStyle"/>
-        <w:keepNext/>
       </w:pPr>
       <w:r>
         <w:t>Manage engineers and projects</w:t>
@@ -176,7 +172,6 @@
     <w:p>
       <w:pPr>
         <w:pStyle w:val="MyBulletStyle"/>
-        <w:keepNext/>
       </w:pPr>
       <w:r>
         <w:t>Developed secure API endpoints and OpenClaw agent skills to automate infrastructure interaction and monitoring</w:t>
@@ -185,7 +180,6 @@
     <w:p>
       <w:pPr>
         <w:pStyle w:val="MyBulletStyle"/>
-        <w:keepNext/>
       </w:pPr>
       <w:r>
         <w:t>Deployed local, privacy-compliant LLMs to accelerate engineering velocity while protecting proprietary data</w:t>
@@ -194,7 +188,6 @@
     <w:p>
       <w:pPr>
         <w:pStyle w:val="MyBulletStyle"/>
-        <w:keepNext/>
       </w:pPr>
       <w:r>
         <w:t>Leveraged AI coding agents to rapidly refactor complex systems and automate infrastructure-as-code</w:t>
@@ -203,7 +196,6 @@
     <w:p>
       <w:pPr>
         <w:pStyle w:val="MyBulletStyle"/>
-        <w:keepNext/>
       </w:pPr>
       <w:r>
         <w:t>Mentored engineering teams on adopting AI-augmented workflows and integrating LLMs into CI/CD pipelines</w:t>
@@ -212,7 +204,6 @@
     <w:p>
       <w:pPr>
         <w:pStyle w:val="MyBulletStyle"/>
-        <w:keepNext/>
       </w:pPr>
       <w:r>
         <w:t>Used Python for API-driven infrastructure automation, real-time systems, robotics, monitoring, and data analysis.</w:t>
@@ -221,7 +212,6 @@
     <w:p>
       <w:pPr>
         <w:pStyle w:val="MyBulletStyle"/>
-        <w:keepNext/>
       </w:pPr>
       <w:r>
         <w:t>Validate R &amp; D plans and results</w:t>
@@ -274,7 +264,6 @@
     <w:p>
       <w:pPr>
         <w:pStyle w:val="MyBulletStyle"/>
-        <w:keepNext/>
       </w:pPr>
       <w:r>
         <w:t>CI/CD with Harness.io, AWS infrastructure with CDK+CFN, Migration to Github Enterprise from 5 other VCS</w:t>
@@ -327,7 +316,6 @@
     <w:p>
       <w:pPr>
         <w:pStyle w:val="MyBulletStyle"/>
-        <w:keepNext/>
       </w:pPr>
       <w:r>
         <w:t>CI/CD with CloudBees/Jenkins and Argo-CD</w:t>
@@ -380,7 +368,6 @@
     <w:p>
       <w:pPr>
         <w:pStyle w:val="MyBulletStyle"/>
-        <w:keepNext/>
       </w:pPr>
       <w:r>
         <w:t>Robotics R&amp;D, GCP, Machine Learning, Computer Vision, Software Development, Network &amp; Physical Architecture, DevSecOps, Linux System Administration</w:t>
@@ -433,7 +420,6 @@
     <w:p>
       <w:pPr>
         <w:pStyle w:val="MyBulletStyle"/>
-        <w:keepNext/>
       </w:pPr>
       <w:r>
         <w:t>CI/CD with Jenkins, SonarQube, JMeter, various software testing tools</w:t>
@@ -442,7 +428,6 @@
     <w:p>
       <w:pPr>
         <w:pStyle w:val="MyBulletStyle"/>
-        <w:keepNext/>
       </w:pPr>
       <w:r>
         <w:t>Azure &amp; AWS infrastructure and network security architecture</w:t>
@@ -486,7 +471,6 @@
     <w:p>
       <w:pPr>
         <w:pStyle w:val="MyBulletStyle"/>
-        <w:keepNext/>
       </w:pPr>
       <w:r>
         <w:t>Direct and train a department of DevOps Engineers and SREs.</w:t>
@@ -495,7 +479,6 @@
     <w:p>
       <w:pPr>
         <w:pStyle w:val="MyBulletStyle"/>
-        <w:keepNext/>
       </w:pPr>
       <w:r>
         <w:t>Train developers to follow DevOps &amp; CI/CD processes.</w:t>
@@ -504,7 +487,6 @@
     <w:p>
       <w:pPr>
         <w:pStyle w:val="MyBulletStyle"/>
-        <w:keepNext/>
       </w:pPr>
       <w:r>
         <w:t>Architect Hybrid-Cloud and Multi-Cloud infrastructure.</w:t>
@@ -513,7 +495,6 @@
     <w:p>
       <w:pPr>
         <w:pStyle w:val="MyBulletStyle"/>
-        <w:keepNext/>
       </w:pPr>
       <w:r>
         <w:t>Set and enforce security practices.</w:t>
@@ -522,7 +503,6 @@
     <w:p>
       <w:pPr>
         <w:pStyle w:val="MyBulletStyle"/>
-        <w:keepNext/>
       </w:pPr>
       <w:r>
         <w:t>Develop tools and services in bash, Node.js, Python, and Go.</w:t>
@@ -531,7 +511,6 @@
     <w:p>
       <w:pPr>
         <w:pStyle w:val="MyBulletStyle"/>
-        <w:keepNext/>
       </w:pPr>
       <w:r>
         <w:t>Design, build, and deploy Docker containers, API Gateways.</w:t>
@@ -540,7 +519,6 @@
     <w:p>
       <w:pPr>
         <w:pStyle w:val="MyBulletStyle"/>
-        <w:keepNext/>
       </w:pPr>
       <w:r>
         <w:t>Automate and orchestrate infrastructure with Packer and Terraform.</w:t>
@@ -584,7 +562,6 @@
     <w:p>
       <w:pPr>
         <w:pStyle w:val="MyBulletStyle"/>
-        <w:keepNext/>
       </w:pPr>
       <w:r>
         <w:t>Orchestrate infrastructure with Packer, Terraform, Chef, and Ansible.</w:t>
@@ -593,7 +570,6 @@
     <w:p>
       <w:pPr>
         <w:pStyle w:val="MyBulletStyle"/>
-        <w:keepNext/>
       </w:pPr>
       <w:r>
         <w:t>Build and maintain Kubernetes clusters serving microservices.</w:t>
@@ -602,7 +578,6 @@
     <w:p>
       <w:pPr>
         <w:pStyle w:val="MyBulletStyle"/>
-        <w:keepNext/>
       </w:pPr>
       <w:r>
         <w:t>Develop tools in Python, Go, bash, awk, sed, CircuitPython, and Arduino.</w:t>
@@ -611,7 +586,6 @@
     <w:p>
       <w:pPr>
         <w:pStyle w:val="MyBulletStyle"/>
-        <w:keepNext/>
       </w:pPr>
       <w:r>
         <w:t>Build and maintain Cassandra, MongoDB, and MySQL databases.</w:t>
@@ -655,7 +629,6 @@
     <w:p>
       <w:pPr>
         <w:pStyle w:val="MyBulletStyle"/>
-        <w:keepNext/>
       </w:pPr>
       <w:r>
         <w:t>Develop mobile client and backend POCs.</w:t>
@@ -664,7 +637,6 @@
     <w:p>
       <w:pPr>
         <w:pStyle w:val="MyBulletStyle"/>
-        <w:keepNext/>
       </w:pPr>
       <w:r>
         <w:t>Architect and deploy cloud infrastructure.</w:t>
@@ -673,7 +645,6 @@
     <w:p>
       <w:pPr>
         <w:pStyle w:val="MyBulletStyle"/>
-        <w:keepNext/>
       </w:pPr>
       <w:r>
         <w:t>Develop and maintain original Open Source software projects.</w:t>
@@ -682,7 +653,6 @@
     <w:p>
       <w:pPr>
         <w:pStyle w:val="MyBulletStyle"/>
-        <w:keepNext/>
       </w:pPr>
       <w:r>
         <w:t>Automated Windows and cloud administration with PowerShell and Python rather than leaving manual GUI procedures undocumented.</w:t>
@@ -726,7 +696,6 @@
     <w:p>
       <w:pPr>
         <w:pStyle w:val="MyBulletStyle"/>
-        <w:keepNext/>
       </w:pPr>
       <w:r>
         <w:t>Co-Manage a ~30 developer team.</w:t>
@@ -735,7 +704,6 @@
     <w:p>
       <w:pPr>
         <w:pStyle w:val="MyBulletStyle"/>
-        <w:keepNext/>
       </w:pPr>
       <w:r>
         <w:t>Improve performance through coaching.</w:t>
@@ -744,7 +712,6 @@
     <w:p>
       <w:pPr>
         <w:pStyle w:val="MyBulletStyle"/>
-        <w:keepNext/>
       </w:pPr>
       <w:r>
         <w:t>Encourage and inspire developers and vendors to give great service.</w:t>
@@ -753,7 +720,6 @@
     <w:p>
       <w:pPr>
         <w:pStyle w:val="MyBulletStyle"/>
-        <w:keepNext/>
       </w:pPr>
       <w:r>
         <w:t>Workflow automation scripting.</w:t>
@@ -797,7 +763,6 @@
     <w:p>
       <w:pPr>
         <w:pStyle w:val="MyBulletStyle"/>
-        <w:keepNext/>
       </w:pPr>
       <w:r>
         <w:t>Administer GNU/Linux servers.</w:t>
@@ -806,7 +771,6 @@
     <w:p>
       <w:pPr>
         <w:pStyle w:val="MyBulletStyle"/>
-        <w:keepNext/>
       </w:pPr>
       <w:r>
         <w:t>Manage a department of sysadmins.</w:t>
@@ -850,7 +814,6 @@
     <w:p>
       <w:pPr>
         <w:pStyle w:val="MyBulletStyle"/>
-        <w:keepNext/>
       </w:pPr>
       <w:r>
         <w:t>Administer MySQL.</w:t>
@@ -859,7 +822,6 @@
     <w:p>
       <w:pPr>
         <w:pStyle w:val="MyBulletStyle"/>
-        <w:keepNext/>
       </w:pPr>
       <w:r>
         <w:t>Optimize developer code.</w:t>
@@ -903,7 +865,6 @@
     <w:p>
       <w:pPr>
         <w:pStyle w:val="MyBulletStyle"/>
-        <w:keepNext/>
       </w:pPr>
       <w:r>
         <w:t>Manage teams, projects, SLAs.</w:t>
@@ -912,7 +873,6 @@
     <w:p>
       <w:pPr>
         <w:pStyle w:val="MyBulletStyle"/>
-        <w:keepNext/>
       </w:pPr>
       <w:r>
         <w:t>Automate workflows.</w:t>
@@ -956,7 +916,6 @@
     <w:p>
       <w:pPr>
         <w:pStyle w:val="MyBulletStyle"/>
-        <w:keepNext/>
       </w:pPr>
       <w:r>
         <w:t>Companies include: Apple Computer, Lanier Worldwide, MedCenterDirect, Amazing Graphics, World Wide Development, and freelance work</w:t>
@@ -982,7 +941,6 @@
     <w:p>
       <w:pPr>
         <w:pStyle w:val="MySectionStyle"/>
-        <w:keepNext/>
       </w:pPr>
       <w:r>
         <w:rPr>
@@ -997,7 +955,6 @@
     <w:p>
       <w:pPr>
         <w:pStyle w:val="MySectionStyle"/>
-        <w:keepNext/>
       </w:pPr>
       <w:r>
         <w:rPr>
@@ -1012,7 +969,6 @@
     <w:p>
       <w:pPr>
         <w:pStyle w:val="MySectionStyle"/>
-        <w:keepNext/>
       </w:pPr>
       <w:r>
         <w:rPr>
@@ -1027,7 +983,6 @@
     <w:p>
       <w:pPr>
         <w:pStyle w:val="MySectionStyle"/>
-        <w:keepNext/>
       </w:pPr>
       <w:r>
         <w:rPr>
@@ -1042,7 +997,6 @@
     <w:p>
       <w:pPr>
         <w:pStyle w:val="MySectionStyle"/>
-        <w:keepNext/>
       </w:pPr>
       <w:r>
         <w:rPr>
@@ -1057,7 +1011,6 @@
     <w:p>
       <w:pPr>
         <w:pStyle w:val="MySectionStyle"/>
-        <w:keepNext/>
       </w:pPr>
       <w:r>
         <w:rPr>
@@ -1072,7 +1025,6 @@
     <w:p>
       <w:pPr>
         <w:pStyle w:val="MySectionStyle"/>
-        <w:keepNext/>
       </w:pPr>
       <w:r>
         <w:rPr>
@@ -1087,7 +1039,6 @@
     <w:p>
       <w:pPr>
         <w:pStyle w:val="MySectionStyle"/>
-        <w:keepNext/>
       </w:pPr>
       <w:r>
         <w:rPr>
@@ -1102,7 +1053,6 @@
     <w:p>
       <w:pPr>
         <w:pStyle w:val="MySectionStyle"/>
-        <w:keepNext/>
       </w:pPr>
       <w:r>
         <w:rPr>
@@ -1117,7 +1067,6 @@
     <w:p>
       <w:pPr>
         <w:pStyle w:val="MySectionStyle"/>
-        <w:keepNext/>
       </w:pPr>
       <w:r>
         <w:rPr>
@@ -1132,7 +1081,6 @@
     <w:p>
       <w:pPr>
         <w:pStyle w:val="MySectionStyle"/>
-        <w:keepNext/>
       </w:pPr>
       <w:r>
         <w:rPr>
@@ -1147,7 +1095,6 @@
     <w:p>
       <w:pPr>
         <w:pStyle w:val="MySectionStyle"/>
-        <w:keepNext/>
       </w:pPr>
       <w:r>
         <w:rPr>
@@ -1162,7 +1109,6 @@
     <w:p>
       <w:pPr>
         <w:pStyle w:val="MySectionStyle"/>
-        <w:keepNext/>
       </w:pPr>
       <w:r>
         <w:rPr>
@@ -1191,7 +1137,7 @@
     <w:sectPr>
       <w:footerReference w:type="default" r:id="rId9"/>
       <w:pgSz w:w="12240" w:h="15840"/>
-      <w:pgMar w:top="216" w:right="432" w:bottom="360" w:left="432" w:header="720" w:footer="720" w:gutter="0"/>
+      <w:pgMar w:top="144" w:right="432" w:bottom="288" w:left="432" w:header="720" w:footer="720" w:gutter="0"/>
       <w:cols w:space="720"/>
       <w:docGrid w:linePitch="360"/>
     </w:sectPr>
@@ -1207,17 +1153,29 @@
       <w:jc w:val="center"/>
     </w:pPr>
     <w:r>
+      <w:rPr>
+        <w:sz w:val="16"/>
+      </w:rPr>
       <w:t xml:space="preserve">Page </w:t>
     </w:r>
     <w:r>
+      <w:rPr>
+        <w:sz w:val="16"/>
+      </w:rPr>
       <w:fldChar w:fldCharType="begin"/>
       <w:instrText xml:space="preserve">PAGE</w:instrText>
       <w:fldChar w:fldCharType="end"/>
     </w:r>
     <w:r>
+      <w:rPr>
+        <w:sz w:val="16"/>
+      </w:rPr>
       <w:t xml:space="preserve"> of </w:t>
     </w:r>
     <w:r>
+      <w:rPr>
+        <w:sz w:val="16"/>
+      </w:rPr>
       <w:fldChar w:fldCharType="begin"/>
       <w:instrText xml:space="preserve">NUMPAGES</w:instrText>
       <w:fldChar w:fldCharType="end"/>
@@ -1589,6 +1547,9 @@
     <w:name w:val="Normal"/>
     <w:qFormat/>
     <w:rsid w:val="00FC693F"/>
+    <w:pPr>
+      <w:spacing w:line="240" w:lineRule="auto" w:after="20"/>
+    </w:pPr>
     <w:rPr>
       <w:rFonts w:ascii="Calibri" w:hAnsi="Calibri"/>
       <w:sz w:val="18"/>
@@ -1649,7 +1610,7 @@
     <w:pPr>
       <w:keepNext/>
       <w:keepLines/>
-      <w:spacing w:before="80" w:after="0"/>
+      <w:spacing w:before="40" w:after="40"/>
       <w:outlineLvl w:val="0"/>
     </w:pPr>
     <w:rPr>
@@ -1936,7 +1897,7 @@
     <w:rsid w:val="00FC693F"/>
     <w:pPr>
       <w:pBdr>
-        <w:bottom w:val="single" w:sz="8" w:space="4" w:color="4F81BD" w:themeColor="accent1"/>
+        <w:bottom w:val="single" w:sz="8" w:space="1" w:color="4F81BD" w:themeColor="accent1"/>
       </w:pBdr>
       <w:spacing w:after="40" w:line="240" w:lineRule="auto"/>
       <w:contextualSpacing/>
@@ -1946,7 +1907,7 @@
       <w:color w:val="17365D" w:themeColor="text2" w:themeShade="BF"/>
       <w:spacing w:val="5"/>
       <w:kern w:val="28"/>
-      <w:sz w:val="52"/>
+      <w:sz w:val="40"/>
       <w:szCs w:val="52"/>
     </w:rPr>
   </w:style>
@@ -13287,7 +13248,8 @@
     <w:name w:val="MyBulletStyle"/>
     <w:basedOn w:val="ListBullet"/>
     <w:pPr>
-      <w:spacing w:after="200"/>
+      <w:spacing w:after="0"/>
+      <w:ind w:left="432" w:hanging="259"/>
     </w:pPr>
   </w:style>
   <w:style w:type="character" w:customStyle="1" w:styleId="CustomLabel">

</xml_diff>

<commit_message>
Headline: option 1, and print it on paper/ATS
"Principal DevOps Engineer | AI-Augmented Automation & Team Training"
leads with a standard, searchable title. The DOCX generator never printed
basics.label, so the paper resume had no headline and one-off overrides
(mysql-dba) had no visible effect; it now goes under the name.

Co-Authored-By: Claude Opus 5.5 <noreply@anthropic.com>
</commit_message>
<xml_diff>
--- a/build/bruno.bronosky.resume.docx
+++ b/build/bruno.bronosky.resume.docx
@@ -9,6 +9,19 @@
       </w:pPr>
       <w:r>
         <w:t>Bruno Bronosky</w:t>
+      </w:r>
+    </w:p>
+    <w:p>
+      <w:pPr>
+        <w:spacing w:after="0"/>
+        <w:jc w:val="center"/>
+      </w:pPr>
+      <w:r>
+        <w:rPr>
+          <w:rStyle w:val="CustomLabel"/>
+          <w:sz w:val="22"/>
+        </w:rPr>
+        <w:t>Principal DevOps Engineer | AI-Augmented Automation &amp; Team Training</w:t>
       </w:r>
     </w:p>
     <w:p>

</xml_diff>

<commit_message>
Review round 3: headline, Various dates, Freelance, DBA bullets one-off only
- Headline: "Principal DevOps Engineer | Team Lead & Trainer".
- "Various" ends with Apple (2004-06), not 2007, so it no longer covers Yahoo.
- Freelance was a rollup of Amazing/MedCenter/Lanier, not a separate job:
  shown nowhere, kept for dates and skills.
- The four MySQL bullets from the old fork stay in the mysql-dba one-off
  only, not on the public web page.

Co-Authored-By: Claude Opus 5.5 <noreply@anthropic.com>
</commit_message>
<xml_diff>
--- a/build/bruno.bronosky.resume.docx
+++ b/build/bruno.bronosky.resume.docx
@@ -21,7 +21,7 @@
           <w:rStyle w:val="CustomLabel"/>
           <w:sz w:val="22"/>
         </w:rPr>
-        <w:t>Principal DevOps Engineer | AI-Augmented Automation &amp; Team Training</w:t>
+        <w:t>Principal DevOps Engineer | Team Lead &amp; Trainer</w:t>
       </w:r>
     </w:p>
     <w:p>
@@ -923,7 +923,7 @@
         <w:t xml:space="preserve"> | </w:t>
       </w:r>
       <w:r>
-        <w:t xml:space="preserve"> (Aug 1995 - Jan 2007)</w:t>
+        <w:t xml:space="preserve"> (Aug 1995 - Jun 2004)</w:t>
       </w:r>
     </w:p>
     <w:p>

</xml_diff>

<commit_message>
Add 2002–2009 PLC / industrial controls consulting experience
</commit_message>
<xml_diff>
--- a/build/bruno.bronosky.resume.docx
+++ b/build/bruno.bronosky.resume.docx
@@ -969,11 +969,68 @@
     </w:p>
     <w:p>
       <w:pPr>
+        <w:pStyle w:val="MySectionStyle"/>
+        <w:keepNext/>
+      </w:pPr>
+      <w:r>
+        <w:rPr>
+          <w:b w:val="0"/>
+        </w:rPr>
+        <w:t>Independent Consulting</w:t>
+      </w:r>
+      <w:r>
+        <w:t xml:space="preserve"> | </w:t>
+      </w:r>
+      <w:r>
+        <w:rPr>
+          <w:rStyle w:val="CustomLabel"/>
+        </w:rPr>
+        <w:t>Industrial Controls / Automation Consultant</w:t>
+      </w:r>
+      <w:r>
+        <w:t xml:space="preserve"> | </w:t>
+      </w:r>
+      <w:r>
+        <w:t xml:space="preserve"> (Jan 2002 - Dec 2009)</w:t>
+      </w:r>
+    </w:p>
+    <w:p>
+      <w:pPr>
+        <w:pStyle w:val="MyBulletStyle"/>
+      </w:pPr>
+      <w:r>
+        <w:t>Programmed, commissioned, and troubleshot Allen-Bradley PLCs using RSLogix (ladder logic)</w:t>
+      </w:r>
+    </w:p>
+    <w:p>
+      <w:pPr>
+        <w:pStyle w:val="MyBulletStyle"/>
+      </w:pPr>
+      <w:r>
+        <w:t>Programmed AutomationDirect DirectLOGIC PLCs using DirectSOFT</w:t>
+      </w:r>
+    </w:p>
+    <w:p>
+      <w:pPr>
         <w:pStyle w:val="Heading1"/>
         <w:keepNext/>
       </w:pPr>
       <w:r>
         <w:t>Skills</w:t>
+      </w:r>
+    </w:p>
+    <w:p>
+      <w:pPr>
+        <w:pStyle w:val="MySectionStyle"/>
+      </w:pPr>
+      <w:r>
+        <w:rPr>
+          <w:rStyle w:val="CustomLabel"/>
+        </w:rPr>
+        <w:t>Industrial Controls</w:t>
+      </w:r>
+      <w:r>
+        <w:t>: Allen-Bradley PLCs · RSLogix · AutomationDirect DirectLOGIC · DirectSOFT · Ladder Logic · Industrial Controls</w:t>
       </w:r>
     </w:p>
     <w:p>

</xml_diff>